<commit_message>
DQE Task 1 fixed
</commit_message>
<xml_diff>
--- a/DQE Task 1/Task01_TamarTutisani.docx
+++ b/DQE Task 1/Task01_TamarTutisani.docx
@@ -286,13 +286,7 @@
               <w:rPr>
                 <w:szCs w:val="20"/>
               </w:rPr>
-              <w:t>Toaster</w:t>
-            </w:r>
-            <w:r>
-              <w:rPr>
-                <w:szCs w:val="20"/>
-              </w:rPr>
-              <w:t xml:space="preserve"> </w:t>
+              <w:t xml:space="preserve">Toaster </w:t>
             </w:r>
             <w:r>
               <w:rPr>
@@ -1299,15 +1293,7 @@
           </w:tcPr>
           <w:p>
             <w:r>
-              <w:t xml:space="preserve">Inspect power cord for damage, cuts, or exposed wires. If damage </w:t>
-            </w:r>
-            <w:proofErr w:type="gramStart"/>
-            <w:r>
-              <w:t>found</w:t>
-            </w:r>
-            <w:proofErr w:type="gramEnd"/>
-            <w:r>
-              <w:t>, do NOT plug in. If cord is intact, plug into outlet → toaster powers on normally. If cord is damaged, cord should not conduct electricity or should show visible warning. User safety is protected.</w:t>
+              <w:t>Verify that internal strain reliefs properly secure the 1800W cord against pulling forces. Negative scenario: If excessive tension or a compromised cord casing is simulated, the design prevents internal wire exposure or immediate short-circuit risks.</w:t>
             </w:r>
           </w:p>
         </w:tc>
@@ -2018,7 +2004,7 @@
           </w:tcPr>
           <w:p>
             <w:r>
-              <w:t>Performance</w:t>
+              <w:t>Functional</w:t>
             </w:r>
           </w:p>
         </w:tc>
@@ -2366,7 +2352,7 @@
           </w:tcPr>
           <w:p>
             <w:r>
-              <w:t>Functional</w:t>
+              <w:t>Reliability</w:t>
             </w:r>
           </w:p>
         </w:tc>
@@ -2438,7 +2424,7 @@
           </w:tcPr>
           <w:p>
             <w:r>
-              <w:t>Functional</w:t>
+              <w:t>Usability / Appearance</w:t>
             </w:r>
           </w:p>
         </w:tc>
@@ -2466,13 +2452,8 @@
             <w:pPr>
               <w:spacing w:line="259" w:lineRule="auto"/>
             </w:pPr>
-            <w:proofErr w:type="gramStart"/>
-            <w:r>
-              <w:t>Toaster withstands</w:t>
-            </w:r>
-            <w:proofErr w:type="gramEnd"/>
-            <w:r>
-              <w:t xml:space="preserve"> water exposure without electrical hazard</w:t>
+            <w:r>
+              <w:t>Enclosure prevents foreign moisture ingress</w:t>
             </w:r>
           </w:p>
         </w:tc>
@@ -2520,7 +2501,7 @@
           </w:tcPr>
           <w:p>
             <w:r>
-              <w:t>Place toaster on counter near sink (≥2 feet away) → operate at browning level 3 while splashing water nearby (simulating kitchen accident). If stray water drips on exterior → water beads up and doesn't seep into vents, power cord connection, or heating elements. No electrical hazard, no sparks, no electrocution risk. Toaster remains safe despite water exposure.</w:t>
+              <w:t>Verify via design documentation and exterior casing checks that top-housing contours redirect minor accidental spills away from internal live components without creating a short-circuit hazard.</w:t>
             </w:r>
           </w:p>
         </w:tc>
@@ -2587,11 +2568,7 @@
           </w:tcPr>
           <w:p>
             <w:r>
-              <w:t xml:space="preserve">Place toaster on counter, use sound meter app or decibel meter, measure noise level at 1 meter distance during toasting cycle at browning level 3 </w:t>
-            </w:r>
-            <w:r>
-              <w:lastRenderedPageBreak/>
-              <w:t xml:space="preserve">→ noise should not exceed typical kitchen appliance levels (~75-80 dB). </w:t>
+              <w:t xml:space="preserve">Place toaster on counter, use sound meter app or decibel meter, measure noise level at 1 meter distance during toasting cycle at browning level 3 → noise should not exceed typical kitchen appliance levels (~75-80 dB). </w:t>
             </w:r>
             <w:proofErr w:type="gramStart"/>
             <w:r>
@@ -2761,7 +2738,6 @@
               <w:spacing w:line="259" w:lineRule="auto"/>
             </w:pPr>
             <w:r>
-              <w:lastRenderedPageBreak/>
               <w:t>Button labels and functions are clear and intuitive</w:t>
             </w:r>
           </w:p>
@@ -2818,15 +2794,46 @@
             </w:r>
             <w:proofErr w:type="gramEnd"/>
             <w:r>
-              <w:t xml:space="preserve"> can identify each button's function without reading manual. Icons or text clearly indicate what each button does.</w:t>
+              <w:t xml:space="preserve"> can identify each </w:t>
+            </w:r>
+            <w:r>
+              <w:lastRenderedPageBreak/>
+              <w:t>button's function without reading manual. Icons or text clearly indicate what each button does.</w:t>
             </w:r>
           </w:p>
         </w:tc>
       </w:tr>
     </w:tbl>
     <w:p/>
+    <w:p>
+      <w:r>
+        <w:t>Jira Onboarding Task Link:</w:t>
+      </w:r>
+    </w:p>
+    <w:p>
+      <w:hyperlink r:id="rId12" w:history="1">
+        <w:r>
+          <w:rPr>
+            <w:rStyle w:val="Hyperlink"/>
+          </w:rPr>
+          <w:t>https://dqdaeau25.atlassian.net/browse</w:t>
+        </w:r>
+        <w:r>
+          <w:rPr>
+            <w:rStyle w:val="Hyperlink"/>
+          </w:rPr>
+          <w:t>/</w:t>
+        </w:r>
+        <w:r>
+          <w:rPr>
+            <w:rStyle w:val="Hyperlink"/>
+          </w:rPr>
+          <w:t>DQ26-102</w:t>
+        </w:r>
+      </w:hyperlink>
+    </w:p>
     <w:sectPr>
-      <w:footerReference w:type="even" r:id="rId12"/>
+      <w:footerReference w:type="even" r:id="rId13"/>
       <w:footnotePr>
         <w:pos w:val="beneathText"/>
       </w:footnotePr>
@@ -8766,12 +8773,7 @@
 </file>
 
 <file path=customXml/item1.xml><?xml version="1.0" encoding="utf-8"?>
-<?mso-contentType ?>
-<FormTemplates xmlns="http://schemas.microsoft.com/sharepoint/v3/contenttype/forms">
-  <Display>DocumentLibraryForm</Display>
-  <Edit>DocumentLibraryForm</Edit>
-  <New>DocumentLibraryForm</New>
-</FormTemplates>
+<b:Sources xmlns:b="http://schemas.openxmlformats.org/officeDocument/2006/bibliography" xmlns="http://schemas.openxmlformats.org/officeDocument/2006/bibliography" SelectedStyle="\APA.XSL" StyleName="APA"/>
 </file>
 
 <file path=customXml/item2.xml><?xml version="1.0" encoding="utf-8"?>
@@ -8786,7 +8788,12 @@
 </file>
 
 <file path=customXml/item3.xml><?xml version="1.0" encoding="utf-8"?>
-<b:Sources xmlns:b="http://schemas.openxmlformats.org/officeDocument/2006/bibliography" xmlns="http://schemas.openxmlformats.org/officeDocument/2006/bibliography" SelectedStyle="\APA.XSL" StyleName="APA"/>
+<?mso-contentType ?>
+<FormTemplates xmlns="http://schemas.microsoft.com/sharepoint/v3/contenttype/forms">
+  <Display>DocumentLibraryForm</Display>
+  <Edit>DocumentLibraryForm</Edit>
+  <New>DocumentLibraryForm</New>
+</FormTemplates>
 </file>
 
 <file path=customXml/item4.xml><?xml version="1.0" encoding="utf-8"?>
@@ -9039,9 +9046,9 @@
 </file>
 
 <file path=customXml/itemProps1.xml><?xml version="1.0" encoding="utf-8"?>
-<ds:datastoreItem xmlns:ds="http://schemas.openxmlformats.org/officeDocument/2006/customXml" ds:itemID="{1ABA52DC-B556-4BA7-AF9D-9FC1AEBDB45C}">
+<ds:datastoreItem xmlns:ds="http://schemas.openxmlformats.org/officeDocument/2006/customXml" ds:itemID="{15A76835-D81F-40B6-8E78-44CB9C07D2DC}">
   <ds:schemaRefs>
-    <ds:schemaRef ds:uri="http://schemas.microsoft.com/sharepoint/v3/contenttype/forms"/>
+    <ds:schemaRef ds:uri="http://schemas.openxmlformats.org/officeDocument/2006/bibliography"/>
   </ds:schemaRefs>
 </ds:datastoreItem>
 </file>
@@ -9058,9 +9065,9 @@
 </file>
 
 <file path=customXml/itemProps3.xml><?xml version="1.0" encoding="utf-8"?>
-<ds:datastoreItem xmlns:ds="http://schemas.openxmlformats.org/officeDocument/2006/customXml" ds:itemID="{15A76835-D81F-40B6-8E78-44CB9C07D2DC}">
+<ds:datastoreItem xmlns:ds="http://schemas.openxmlformats.org/officeDocument/2006/customXml" ds:itemID="{1ABA52DC-B556-4BA7-AF9D-9FC1AEBDB45C}">
   <ds:schemaRefs>
-    <ds:schemaRef ds:uri="http://schemas.openxmlformats.org/officeDocument/2006/bibliography"/>
+    <ds:schemaRef ds:uri="http://schemas.microsoft.com/sharepoint/v3/contenttype/forms"/>
   </ds:schemaRefs>
 </ds:datastoreItem>
 </file>

</xml_diff>